<commit_message>
fix: paint floating page-furniture images
</commit_message>
<xml_diff>
--- a/parity/fixtures/isolated-page-furniture.docx
+++ b/parity/fixtures/isolated-page-furniture.docx
@@ -234,6 +234,18 @@
   <w:style w:type="paragraph" w:default="1" w:styleId="Normal">
     <w:name w:val="Normal"/>
   </w:style>
+  <w:style w:type="table" w:default="1" w:styleId="TableNormal">
+    <w:name w:val="Normal Table"/>
+    <w:tblPr>
+      <w:tblInd w:w="0" w:type="dxa"/>
+      <w:tblCellMar>
+        <w:top w:w="0" w:type="dxa"/>
+        <w:left w:w="108" w:type="dxa"/>
+        <w:bottom w:w="0" w:type="dxa"/>
+        <w:right w:w="108" w:type="dxa"/>
+      </w:tblCellMar>
+    </w:tblPr>
+  </w:style>
   <w:style w:type="paragraph" w:styleId="Heading1">
     <w:name w:val="heading 1"/>
     <w:basedOn w:val="Normal"/>

</xml_diff>

<commit_message>
fix: paint page-furniture images and generate layout matrix (#793)
* test: generate pairwise layout matrix

* fix: paint floating page-furniture images

* fix: address layout matrix review
</commit_message>
<xml_diff>
--- a/parity/fixtures/isolated-page-furniture.docx
+++ b/parity/fixtures/isolated-page-furniture.docx
@@ -234,6 +234,18 @@
   <w:style w:type="paragraph" w:default="1" w:styleId="Normal">
     <w:name w:val="Normal"/>
   </w:style>
+  <w:style w:type="table" w:default="1" w:styleId="TableNormal">
+    <w:name w:val="Normal Table"/>
+    <w:tblPr>
+      <w:tblInd w:w="0" w:type="dxa"/>
+      <w:tblCellMar>
+        <w:top w:w="0" w:type="dxa"/>
+        <w:left w:w="108" w:type="dxa"/>
+        <w:bottom w:w="0" w:type="dxa"/>
+        <w:right w:w="108" w:type="dxa"/>
+      </w:tblCellMar>
+    </w:tblPr>
+  </w:style>
   <w:style w:type="paragraph" w:styleId="Heading1">
     <w:name w:val="heading 1"/>
     <w:basedOn w:val="Normal"/>

</xml_diff>